<commit_message>
Wilson: Updated Phase 3 report (TCP Scapy Development and Wireshark Analysis results)
</commit_message>
<xml_diff>
--- a/Phase3_Implementation/TCP Scapy Development and Wireshark Analysis results.docx
+++ b/Phase3_Implementation/TCP Scapy Development and Wireshark Analysis results.docx
@@ -11,6 +11,7 @@
           <w:b/>
           <w:bCs/>
           <w:color w:val="000000" w:themeColor="text1"/>
+          <w:lang w:val="en-US"/>
         </w:rPr>
       </w:pPr>
       <w:r>
@@ -19,6 +20,7 @@
           <w:b/>
           <w:bCs/>
           <w:color w:val="000000" w:themeColor="text1"/>
+          <w:lang w:val="en-US"/>
         </w:rPr>
         <w:t>Custom Protocol Simulation Project</w:t>
       </w:r>
@@ -32,6 +34,7 @@
           <w:b/>
           <w:bCs/>
           <w:color w:val="000000" w:themeColor="text1"/>
+          <w:lang w:val="en-US"/>
         </w:rPr>
       </w:pPr>
       <w:r>
@@ -40,45 +43,10 @@
           <w:b/>
           <w:bCs/>
           <w:color w:val="000000" w:themeColor="text1"/>
+          <w:lang w:val="en-US"/>
         </w:rPr>
         <w:t>Capstone Project Report</w:t>
       </w:r>
-    </w:p>
-    <w:p>
-      <w:pPr>
-        <w:spacing w:line="360" w:lineRule="auto"/>
-        <w:rPr>
-          <w:rFonts w:ascii="Times New Roman" w:hAnsi="Times New Roman" w:cs="Times New Roman"/>
-          <w:color w:val="000000" w:themeColor="text1"/>
-        </w:rPr>
-      </w:pPr>
-    </w:p>
-    <w:p>
-      <w:pPr>
-        <w:spacing w:line="360" w:lineRule="auto"/>
-        <w:rPr>
-          <w:rFonts w:ascii="Times New Roman" w:hAnsi="Times New Roman" w:cs="Times New Roman"/>
-          <w:color w:val="000000" w:themeColor="text1"/>
-        </w:rPr>
-      </w:pPr>
-    </w:p>
-    <w:p>
-      <w:pPr>
-        <w:spacing w:line="360" w:lineRule="auto"/>
-        <w:rPr>
-          <w:rFonts w:ascii="Times New Roman" w:hAnsi="Times New Roman" w:cs="Times New Roman"/>
-          <w:color w:val="000000" w:themeColor="text1"/>
-        </w:rPr>
-      </w:pPr>
-    </w:p>
-    <w:p>
-      <w:pPr>
-        <w:spacing w:line="360" w:lineRule="auto"/>
-        <w:rPr>
-          <w:rFonts w:ascii="Times New Roman" w:hAnsi="Times New Roman" w:cs="Times New Roman"/>
-          <w:color w:val="000000" w:themeColor="text1"/>
-        </w:rPr>
-      </w:pPr>
     </w:p>
     <w:p>
       <w:pPr>
@@ -89,6 +57,7 @@
           <w:b/>
           <w:bCs/>
           <w:color w:val="000000" w:themeColor="text1"/>
+          <w:lang w:val="en-US"/>
         </w:rPr>
       </w:pPr>
       <w:r>
@@ -97,6 +66,7 @@
           <w:b/>
           <w:bCs/>
           <w:color w:val="000000" w:themeColor="text1"/>
+          <w:lang w:val="en-US"/>
         </w:rPr>
         <w:t>Unit Code: CSG3101 - Applied Project</w:t>
       </w:r>
@@ -106,9 +76,10 @@
           <w:b/>
           <w:bCs/>
           <w:color w:val="000000" w:themeColor="text1"/>
+          <w:lang w:val="en-US"/>
         </w:rPr>
         <w:br/>
-        <w:t xml:space="preserve">Edith Cowan University </w:t>
+        <w:t>Edith Cowan University</w:t>
       </w:r>
     </w:p>
     <w:p>
@@ -120,6 +91,7 @@
           <w:b/>
           <w:bCs/>
           <w:color w:val="000000" w:themeColor="text1"/>
+          <w:lang w:val="en-US"/>
         </w:rPr>
       </w:pPr>
       <w:r>
@@ -128,6 +100,7 @@
           <w:b/>
           <w:bCs/>
           <w:color w:val="000000" w:themeColor="text1"/>
+          <w:lang w:val="en-US"/>
         </w:rPr>
         <w:t>Date: September 2025</w:t>
       </w:r>
@@ -135,228 +108,422 @@
     <w:p>
       <w:pPr>
         <w:spacing w:line="360" w:lineRule="auto"/>
-        <w:jc w:val="center"/>
         <w:rPr>
           <w:rFonts w:ascii="Times New Roman" w:hAnsi="Times New Roman" w:cs="Times New Roman"/>
           <w:b/>
           <w:bCs/>
           <w:color w:val="000000" w:themeColor="text1"/>
-        </w:rPr>
-      </w:pPr>
-    </w:p>
-    <w:p>
-      <w:pPr>
-        <w:spacing w:line="360" w:lineRule="auto"/>
-        <w:jc w:val="center"/>
+          <w:lang w:val="en-US"/>
+        </w:rPr>
+      </w:pPr>
+    </w:p>
+    <w:p>
+      <w:pPr>
+        <w:spacing w:line="360" w:lineRule="auto"/>
         <w:rPr>
           <w:rFonts w:ascii="Times New Roman" w:hAnsi="Times New Roman" w:cs="Times New Roman"/>
           <w:b/>
           <w:bCs/>
           <w:color w:val="000000" w:themeColor="text1"/>
-        </w:rPr>
-      </w:pPr>
-    </w:p>
-    <w:p>
-      <w:pPr>
-        <w:spacing w:line="360" w:lineRule="auto"/>
-        <w:jc w:val="center"/>
+          <w:u w:val="single"/>
+          <w:lang w:val="en-US"/>
+        </w:rPr>
+      </w:pPr>
+      <w:r>
         <w:rPr>
           <w:rFonts w:ascii="Times New Roman" w:hAnsi="Times New Roman" w:cs="Times New Roman"/>
           <w:b/>
           <w:bCs/>
           <w:color w:val="000000" w:themeColor="text1"/>
-        </w:rPr>
-      </w:pPr>
-    </w:p>
-    <w:p>
-      <w:pPr>
-        <w:spacing w:line="360" w:lineRule="auto"/>
-        <w:jc w:val="center"/>
+          <w:u w:val="single"/>
+          <w:lang w:val="en-US"/>
+        </w:rPr>
+        <w:t>GROUP MEMBERS</w:t>
+      </w:r>
+    </w:p>
+    <w:p>
+      <w:pPr>
+        <w:spacing w:line="360" w:lineRule="auto"/>
         <w:rPr>
           <w:rFonts w:ascii="Times New Roman" w:hAnsi="Times New Roman" w:cs="Times New Roman"/>
           <w:b/>
           <w:bCs/>
           <w:color w:val="000000" w:themeColor="text1"/>
-        </w:rPr>
-      </w:pPr>
-    </w:p>
-    <w:p>
-      <w:pPr>
-        <w:spacing w:line="360" w:lineRule="auto"/>
-        <w:jc w:val="center"/>
+          <w:lang w:val="en-US"/>
+        </w:rPr>
+      </w:pPr>
+      <w:r>
         <w:rPr>
           <w:rFonts w:ascii="Times New Roman" w:hAnsi="Times New Roman" w:cs="Times New Roman"/>
           <w:b/>
           <w:bCs/>
           <w:color w:val="000000" w:themeColor="text1"/>
-        </w:rPr>
-      </w:pPr>
-    </w:p>
-    <w:p>
-      <w:pPr>
-        <w:spacing w:line="360" w:lineRule="auto"/>
-        <w:jc w:val="center"/>
+          <w:lang w:val="en-US"/>
+        </w:rPr>
+        <w:t>STUDENT NAME: PHILLIP MWANGUKU</w:t>
+      </w:r>
+    </w:p>
+    <w:p>
+      <w:pPr>
+        <w:spacing w:line="360" w:lineRule="auto"/>
         <w:rPr>
           <w:rFonts w:ascii="Times New Roman" w:hAnsi="Times New Roman" w:cs="Times New Roman"/>
           <w:b/>
           <w:bCs/>
           <w:color w:val="000000" w:themeColor="text1"/>
-        </w:rPr>
-      </w:pPr>
-    </w:p>
-    <w:p>
-      <w:pPr>
-        <w:spacing w:line="360" w:lineRule="auto"/>
-        <w:jc w:val="center"/>
+          <w:lang w:val="en-US"/>
+        </w:rPr>
+      </w:pPr>
+      <w:r>
         <w:rPr>
           <w:rFonts w:ascii="Times New Roman" w:hAnsi="Times New Roman" w:cs="Times New Roman"/>
           <w:b/>
           <w:bCs/>
           <w:color w:val="000000" w:themeColor="text1"/>
-        </w:rPr>
-      </w:pPr>
-    </w:p>
-    <w:p>
-      <w:pPr>
-        <w:spacing w:line="360" w:lineRule="auto"/>
-        <w:jc w:val="center"/>
+          <w:lang w:val="en-US"/>
+        </w:rPr>
+        <w:t>STUDENT ID: 10619172</w:t>
+      </w:r>
+    </w:p>
+    <w:p>
+      <w:pPr>
+        <w:spacing w:line="360" w:lineRule="auto"/>
         <w:rPr>
           <w:rFonts w:ascii="Times New Roman" w:hAnsi="Times New Roman" w:cs="Times New Roman"/>
           <w:b/>
           <w:bCs/>
           <w:color w:val="000000" w:themeColor="text1"/>
-        </w:rPr>
-      </w:pPr>
-    </w:p>
-    <w:p>
-      <w:pPr>
-        <w:spacing w:line="360" w:lineRule="auto"/>
-        <w:jc w:val="center"/>
+          <w:lang w:val="en-US"/>
+        </w:rPr>
+      </w:pPr>
+    </w:p>
+    <w:p>
+      <w:pPr>
+        <w:spacing w:line="360" w:lineRule="auto"/>
         <w:rPr>
           <w:rFonts w:ascii="Times New Roman" w:hAnsi="Times New Roman" w:cs="Times New Roman"/>
           <w:b/>
           <w:bCs/>
           <w:color w:val="000000" w:themeColor="text1"/>
-        </w:rPr>
-      </w:pPr>
-    </w:p>
-    <w:p>
-      <w:pPr>
-        <w:spacing w:line="360" w:lineRule="auto"/>
-        <w:jc w:val="center"/>
+          <w:lang w:val="en-US"/>
+        </w:rPr>
+      </w:pPr>
+      <w:r>
         <w:rPr>
           <w:rFonts w:ascii="Times New Roman" w:hAnsi="Times New Roman" w:cs="Times New Roman"/>
           <w:b/>
           <w:bCs/>
           <w:color w:val="000000" w:themeColor="text1"/>
-        </w:rPr>
-      </w:pPr>
-    </w:p>
-    <w:p>
-      <w:pPr>
-        <w:spacing w:line="360" w:lineRule="auto"/>
-        <w:jc w:val="center"/>
+          <w:lang w:val="en-US"/>
+        </w:rPr>
+        <w:t>STUDENT NAME: CHILUFYA JOSEPH KAWIMBE</w:t>
+      </w:r>
+    </w:p>
+    <w:p>
+      <w:pPr>
+        <w:spacing w:line="360" w:lineRule="auto"/>
         <w:rPr>
           <w:rFonts w:ascii="Times New Roman" w:hAnsi="Times New Roman" w:cs="Times New Roman"/>
           <w:b/>
           <w:bCs/>
           <w:color w:val="000000" w:themeColor="text1"/>
-        </w:rPr>
-      </w:pPr>
-    </w:p>
-    <w:p>
-      <w:pPr>
-        <w:spacing w:line="360" w:lineRule="auto"/>
-        <w:jc w:val="center"/>
+          <w:lang w:val="en-US"/>
+        </w:rPr>
+      </w:pPr>
+      <w:r>
         <w:rPr>
           <w:rFonts w:ascii="Times New Roman" w:hAnsi="Times New Roman" w:cs="Times New Roman"/>
           <w:b/>
           <w:bCs/>
           <w:color w:val="000000" w:themeColor="text1"/>
-        </w:rPr>
-      </w:pPr>
-      <w:r>
+          <w:lang w:val="en-US"/>
+        </w:rPr>
+        <w:t xml:space="preserve">STUDENT ID: 10620355 </w:t>
+      </w:r>
+    </w:p>
+    <w:p>
+      <w:pPr>
+        <w:spacing w:line="360" w:lineRule="auto"/>
         <w:rPr>
           <w:rFonts w:ascii="Times New Roman" w:hAnsi="Times New Roman" w:cs="Times New Roman"/>
           <w:b/>
           <w:bCs/>
           <w:color w:val="000000" w:themeColor="text1"/>
-        </w:rPr>
-        <w:t xml:space="preserve">TCP </w:t>
-      </w:r>
-      <w:proofErr w:type="spellStart"/>
-      <w:r>
+          <w:lang w:val="en-US"/>
+        </w:rPr>
+      </w:pPr>
+    </w:p>
+    <w:p>
+      <w:pPr>
+        <w:spacing w:line="360" w:lineRule="auto"/>
         <w:rPr>
           <w:rFonts w:ascii="Times New Roman" w:hAnsi="Times New Roman" w:cs="Times New Roman"/>
           <w:b/>
           <w:bCs/>
           <w:color w:val="000000" w:themeColor="text1"/>
-        </w:rPr>
-        <w:t>Scapy</w:t>
-      </w:r>
-      <w:proofErr w:type="spellEnd"/>
+          <w:lang w:val="en-US"/>
+        </w:rPr>
+      </w:pPr>
       <w:r>
         <w:rPr>
           <w:rFonts w:ascii="Times New Roman" w:hAnsi="Times New Roman" w:cs="Times New Roman"/>
           <w:b/>
           <w:bCs/>
           <w:color w:val="000000" w:themeColor="text1"/>
-        </w:rPr>
-        <w:t xml:space="preserve"> Development </w:t>
-      </w:r>
-      <w:r>
+          <w:lang w:val="en-US"/>
+        </w:rPr>
+        <w:t>STUDENT NAME: WILSON MUGWE GATHII</w:t>
+      </w:r>
+    </w:p>
+    <w:p>
+      <w:pPr>
+        <w:spacing w:line="360" w:lineRule="auto"/>
         <w:rPr>
           <w:rFonts w:ascii="Times New Roman" w:hAnsi="Times New Roman" w:cs="Times New Roman"/>
           <w:b/>
           <w:bCs/>
           <w:color w:val="000000" w:themeColor="text1"/>
-        </w:rPr>
-        <w:t>and</w:t>
-      </w:r>
+          <w:lang w:val="en-US"/>
+        </w:rPr>
+      </w:pPr>
       <w:r>
         <w:rPr>
           <w:rFonts w:ascii="Times New Roman" w:hAnsi="Times New Roman" w:cs="Times New Roman"/>
           <w:b/>
           <w:bCs/>
           <w:color w:val="000000" w:themeColor="text1"/>
+          <w:lang w:val="en-US"/>
+        </w:rPr>
+        <w:t>STUDENT ID: 10641382</w:t>
+      </w:r>
+    </w:p>
+    <w:p>
+      <w:pPr>
+        <w:spacing w:line="360" w:lineRule="auto"/>
+        <w:rPr>
+          <w:rFonts w:ascii="Times New Roman" w:hAnsi="Times New Roman" w:cs="Times New Roman"/>
+          <w:b/>
+          <w:bCs/>
+          <w:color w:val="000000" w:themeColor="text1"/>
+          <w:lang w:val="en-US"/>
+        </w:rPr>
+      </w:pPr>
+    </w:p>
+    <w:p>
+      <w:pPr>
+        <w:spacing w:line="360" w:lineRule="auto"/>
+        <w:rPr>
+          <w:rFonts w:ascii="Times New Roman" w:hAnsi="Times New Roman" w:cs="Times New Roman"/>
+          <w:b/>
+          <w:bCs/>
+          <w:color w:val="000000" w:themeColor="text1"/>
+          <w:lang w:val="en-US"/>
+        </w:rPr>
+      </w:pPr>
+      <w:r>
+        <w:rPr>
+          <w:rFonts w:ascii="Times New Roman" w:hAnsi="Times New Roman" w:cs="Times New Roman"/>
+          <w:b/>
+          <w:bCs/>
+          <w:color w:val="000000" w:themeColor="text1"/>
+          <w:lang w:val="en-US"/>
+        </w:rPr>
+        <w:t>STUDENT NAME: DIPESH NEPAL</w:t>
+      </w:r>
+      <w:r>
+        <w:rPr>
+          <w:rFonts w:ascii="Times New Roman" w:hAnsi="Times New Roman" w:cs="Times New Roman"/>
+          <w:b/>
+          <w:bCs/>
+          <w:color w:val="000000" w:themeColor="text1"/>
+          <w:lang w:val="en-US"/>
+        </w:rPr>
+        <w:tab/>
+      </w:r>
+    </w:p>
+    <w:p>
+      <w:pPr>
+        <w:spacing w:line="360" w:lineRule="auto"/>
+        <w:rPr>
+          <w:rFonts w:ascii="Times New Roman" w:hAnsi="Times New Roman" w:cs="Times New Roman"/>
+          <w:b/>
+          <w:bCs/>
+          <w:color w:val="000000" w:themeColor="text1"/>
+          <w:lang w:val="en-US"/>
+        </w:rPr>
+      </w:pPr>
+      <w:r>
+        <w:rPr>
+          <w:rFonts w:ascii="Times New Roman" w:hAnsi="Times New Roman" w:cs="Times New Roman"/>
+          <w:b/>
+          <w:bCs/>
+          <w:color w:val="000000" w:themeColor="text1"/>
+          <w:lang w:val="en-US"/>
+        </w:rPr>
+        <w:t>STUDENT ID: 10643078</w:t>
+      </w:r>
+    </w:p>
+    <w:p>
+      <w:pPr>
+        <w:spacing w:line="360" w:lineRule="auto"/>
+        <w:rPr>
+          <w:rFonts w:ascii="Times New Roman" w:hAnsi="Times New Roman" w:cs="Times New Roman"/>
+          <w:b/>
+          <w:bCs/>
+          <w:color w:val="000000" w:themeColor="text1"/>
+          <w:lang w:val="en-US"/>
+        </w:rPr>
+      </w:pPr>
+    </w:p>
+    <w:p>
+      <w:pPr>
+        <w:spacing w:line="360" w:lineRule="auto"/>
+        <w:rPr>
+          <w:rFonts w:ascii="Times New Roman" w:hAnsi="Times New Roman" w:cs="Times New Roman"/>
+          <w:b/>
+          <w:bCs/>
+          <w:color w:val="000000" w:themeColor="text1"/>
+          <w:lang w:val="en-US"/>
+        </w:rPr>
+      </w:pPr>
+      <w:r>
+        <w:rPr>
+          <w:rFonts w:ascii="Times New Roman" w:hAnsi="Times New Roman" w:cs="Times New Roman"/>
+          <w:b/>
+          <w:bCs/>
+          <w:color w:val="000000" w:themeColor="text1"/>
+          <w:lang w:val="en-US"/>
+        </w:rPr>
+        <w:t xml:space="preserve">STUDENT NAME: NAYARA ROCHELLE BAMUNUGE PERERA </w:t>
+      </w:r>
+    </w:p>
+    <w:p>
+      <w:pPr>
+        <w:spacing w:line="360" w:lineRule="auto"/>
+        <w:rPr>
+          <w:rFonts w:ascii="Times New Roman" w:hAnsi="Times New Roman" w:cs="Times New Roman"/>
+          <w:b/>
+          <w:bCs/>
+          <w:color w:val="000000" w:themeColor="text1"/>
+          <w:lang w:val="en-US"/>
+        </w:rPr>
+      </w:pPr>
+      <w:r>
+        <w:rPr>
+          <w:rFonts w:ascii="Times New Roman" w:hAnsi="Times New Roman" w:cs="Times New Roman"/>
+          <w:b/>
+          <w:bCs/>
+          <w:color w:val="000000" w:themeColor="text1"/>
+          <w:lang w:val="en-US"/>
+        </w:rPr>
+        <w:t>STUDENT ID: 10662685</w:t>
+      </w:r>
+    </w:p>
+    <w:p>
+      <w:pPr>
+        <w:spacing w:line="360" w:lineRule="auto"/>
+        <w:jc w:val="center"/>
+        <w:rPr>
+          <w:rFonts w:ascii="Times New Roman" w:hAnsi="Times New Roman" w:cs="Times New Roman"/>
+          <w:b/>
+          <w:bCs/>
+          <w:color w:val="000000" w:themeColor="text1"/>
+        </w:rPr>
+      </w:pPr>
+    </w:p>
+    <w:p>
+      <w:pPr>
+        <w:spacing w:line="360" w:lineRule="auto"/>
+        <w:jc w:val="center"/>
+        <w:rPr>
+          <w:rFonts w:ascii="Times New Roman" w:hAnsi="Times New Roman" w:cs="Times New Roman"/>
+          <w:b/>
+          <w:bCs/>
+          <w:color w:val="000000" w:themeColor="text1"/>
+        </w:rPr>
+      </w:pPr>
+    </w:p>
+    <w:p>
+      <w:pPr>
+        <w:spacing w:line="360" w:lineRule="auto"/>
+        <w:jc w:val="center"/>
+        <w:rPr>
+          <w:rFonts w:ascii="Times New Roman" w:hAnsi="Times New Roman" w:cs="Times New Roman"/>
+          <w:b/>
+          <w:bCs/>
+          <w:color w:val="000000" w:themeColor="text1"/>
+        </w:rPr>
+      </w:pPr>
+    </w:p>
+    <w:p>
+      <w:pPr>
+        <w:spacing w:line="360" w:lineRule="auto"/>
+        <w:jc w:val="center"/>
+        <w:rPr>
+          <w:rFonts w:ascii="Times New Roman" w:hAnsi="Times New Roman" w:cs="Times New Roman"/>
+          <w:b/>
+          <w:bCs/>
+          <w:color w:val="000000" w:themeColor="text1"/>
+        </w:rPr>
+      </w:pPr>
+      <w:r>
+        <w:rPr>
+          <w:rFonts w:ascii="Times New Roman" w:hAnsi="Times New Roman" w:cs="Times New Roman"/>
+          <w:b/>
+          <w:bCs/>
+          <w:color w:val="000000" w:themeColor="text1"/>
+        </w:rPr>
+        <w:t xml:space="preserve">TCP </w:t>
+      </w:r>
+      <w:proofErr w:type="spellStart"/>
+      <w:r>
+        <w:rPr>
+          <w:rFonts w:ascii="Times New Roman" w:hAnsi="Times New Roman" w:cs="Times New Roman"/>
+          <w:b/>
+          <w:bCs/>
+          <w:color w:val="000000" w:themeColor="text1"/>
+        </w:rPr>
+        <w:t>Scapy</w:t>
+      </w:r>
+      <w:proofErr w:type="spellEnd"/>
+      <w:r>
+        <w:rPr>
+          <w:rFonts w:ascii="Times New Roman" w:hAnsi="Times New Roman" w:cs="Times New Roman"/>
+          <w:b/>
+          <w:bCs/>
+          <w:color w:val="000000" w:themeColor="text1"/>
+        </w:rPr>
+        <w:t xml:space="preserve"> Development </w:t>
+      </w:r>
+      <w:r>
+        <w:rPr>
+          <w:rFonts w:ascii="Times New Roman" w:hAnsi="Times New Roman" w:cs="Times New Roman"/>
+          <w:b/>
+          <w:bCs/>
+          <w:color w:val="000000" w:themeColor="text1"/>
+        </w:rPr>
+        <w:t>and</w:t>
+      </w:r>
+      <w:r>
+        <w:rPr>
+          <w:rFonts w:ascii="Times New Roman" w:hAnsi="Times New Roman" w:cs="Times New Roman"/>
+          <w:b/>
+          <w:bCs/>
+          <w:color w:val="000000" w:themeColor="text1"/>
         </w:rPr>
         <w:t xml:space="preserve"> Wireshark Analysis</w:t>
       </w:r>
-    </w:p>
-    <w:p>
-      <w:pPr>
-        <w:spacing w:line="360" w:lineRule="auto"/>
-        <w:rPr>
-          <w:rFonts w:ascii="Times New Roman" w:hAnsi="Times New Roman" w:cs="Times New Roman"/>
-          <w:color w:val="000000" w:themeColor="text1"/>
-        </w:rPr>
-      </w:pPr>
-    </w:p>
-    <w:p>
-      <w:pPr>
-        <w:spacing w:line="360" w:lineRule="auto"/>
-        <w:rPr>
-          <w:rFonts w:ascii="Times New Roman" w:hAnsi="Times New Roman" w:cs="Times New Roman"/>
-          <w:color w:val="000000" w:themeColor="text1"/>
-        </w:rPr>
-      </w:pPr>
-    </w:p>
-    <w:p>
-      <w:pPr>
-        <w:spacing w:line="360" w:lineRule="auto"/>
-        <w:rPr>
-          <w:rFonts w:ascii="Times New Roman" w:hAnsi="Times New Roman" w:cs="Times New Roman"/>
-          <w:color w:val="000000" w:themeColor="text1"/>
-        </w:rPr>
-      </w:pPr>
     </w:p>
     <w:sdt>
       <w:sdtPr>
         <w:rPr>
-          <w:rFonts w:ascii="Times New Roman" w:hAnsi="Times New Roman" w:cs="Times New Roman"/>
-          <w:color w:val="000000" w:themeColor="text1"/>
+          <w:rFonts w:ascii="Times New Roman" w:eastAsiaTheme="minorHAnsi" w:hAnsi="Times New Roman" w:cs="Times New Roman"/>
+          <w:color w:val="000000" w:themeColor="text1"/>
+          <w:kern w:val="2"/>
           <w:sz w:val="24"/>
           <w:szCs w:val="24"/>
+          <w:lang w:val="en-AU"/>
+          <w14:ligatures w14:val="standardContextual"/>
         </w:rPr>
         <w:id w:val="-2012371526"/>
         <w:docPartObj>
@@ -366,13 +533,9 @@
       </w:sdtPr>
       <w:sdtEndPr>
         <w:rPr>
-          <w:rFonts w:eastAsiaTheme="minorHAnsi"/>
           <w:b/>
           <w:bCs/>
           <w:noProof/>
-          <w:kern w:val="2"/>
-          <w:lang w:val="en-AU"/>
-          <w14:ligatures w14:val="standardContextual"/>
         </w:rPr>
       </w:sdtEndPr>
       <w:sdtContent>

</xml_diff>